<commit_message>
docs: fix level count + clarify vocab data is pre-packed
- App has Level 1–6 (~6,255 cards), not L01–L70 / 7,000 as originally written.
- Add explicit note that docs/data/L1.json~L6.json (4.3 MB total) is
  shipped in the repo, so forking is enough — no data generation step.
- Regenerate Word doc.

Co-Authored-By: Claude Opus 4.7 <noreply@anthropic.com>
</commit_message>
<xml_diff>
--- a/Vocab-SRS-安裝與使用說明.docx
+++ b/Vocab-SRS-安裝與使用說明.docx
@@ -70,7 +70,21 @@
         <w:rPr>
           <w:rFonts w:ascii="微軟正黑體" w:cs="微軟正黑體" w:eastAsia="微軟正黑體" w:hAnsi="微軟正黑體"/>
         </w:rPr>
-        <w:t xml:space="preserve">,跟著做完,你的家人就能在 iPhone / Android / iPad 上練 7000 字英文單字,跨裝置自動同步。</w:t>
+        <w:t xml:space="preserve">,跟著做完,你的家人就能在 iPhone / Android / iPad 上練 </w:t>
+      </w:r>
+      <w:r>
+        <w:rPr>
+          <w:rFonts w:ascii="微軟正黑體" w:cs="微軟正黑體" w:eastAsia="微軟正黑體" w:hAnsi="微軟正黑體"/>
+          <w:b/>
+          <w:bCs/>
+        </w:rPr>
+        <w:t xml:space="preserve">6,255 字英文單字</w:t>
+      </w:r>
+      <w:r>
+        <w:rPr>
+          <w:rFonts w:ascii="微軟正黑體" w:cs="微軟正黑體" w:eastAsia="微軟正黑體" w:hAnsi="微軟正黑體"/>
+        </w:rPr>
+        <w:t xml:space="preserve"> (Level 1–6,每級約 1,000 字,字庫已預先打包在 repo 裡),跨裝置自動同步。</w:t>
       </w:r>
     </w:p>
     <w:p>
@@ -90,6 +104,55 @@
           <w:rFonts w:ascii="微軟正黑體" w:cs="微軟正黑體" w:eastAsia="微軟正黑體" w:hAnsi="微軟正黑體"/>
         </w:rPr>
         <w:t xml:space="preserve"> 只需要瀏覽器。</w:t>
+      </w:r>
+    </w:p>
+    <w:p>
+      <w:pPr>
+        <w:spacing w:after="120"/>
+      </w:pPr>
+      <w:r>
+        <w:rPr>
+          <w:rFonts w:ascii="微軟正黑體" w:cs="微軟正黑體" w:eastAsia="微軟正黑體" w:hAnsi="微軟正黑體"/>
+          <w:b/>
+          <w:bCs/>
+        </w:rPr>
+        <w:t xml:space="preserve">字庫已經打包好</w:t>
+      </w:r>
+      <w:r>
+        <w:rPr>
+          <w:rFonts w:ascii="微軟正黑體" w:cs="微軟正黑體" w:eastAsia="微軟正黑體" w:hAnsi="微軟正黑體"/>
+        </w:rPr>
+        <w:t xml:space="preserve"> —— 6,255 字的英文單字、中文翻譯、字典定義、發音音檔網址,全部已經放在 </w:t>
+      </w:r>
+      <w:r>
+        <w:rPr>
+          <w:rFonts w:ascii="Consolas" w:cs="Consolas" w:eastAsia="Consolas" w:hAnsi="Consolas"/>
+          <w:sz w:val="22"/>
+          <w:szCs w:val="22"/>
+          <w:shd w:fill="F2F2F2" w:val="clear"/>
+        </w:rPr>
+        <w:t xml:space="preserve">docs/data/L1.json</w:t>
+      </w:r>
+      <w:r>
+        <w:rPr>
+          <w:rFonts w:ascii="微軟正黑體" w:cs="微軟正黑體" w:eastAsia="微軟正黑體" w:hAnsi="微軟正黑體"/>
+        </w:rPr>
+        <w:t xml:space="preserve"> ~ </w:t>
+      </w:r>
+      <w:r>
+        <w:rPr>
+          <w:rFonts w:ascii="Consolas" w:cs="Consolas" w:eastAsia="Consolas" w:hAnsi="Consolas"/>
+          <w:sz w:val="22"/>
+          <w:szCs w:val="22"/>
+          <w:shd w:fill="F2F2F2" w:val="clear"/>
+        </w:rPr>
+        <w:t xml:space="preserve">L6.json</w:t>
+      </w:r>
+      <w:r>
+        <w:rPr>
+          <w:rFonts w:ascii="微軟正黑體" w:cs="微軟正黑體" w:eastAsia="微軟正黑體" w:hAnsi="微軟正黑體"/>
+        </w:rPr>
+        <w:t xml:space="preserve"> (共約 4.3 MB),fork 過去就有,不用自己跑任何資料生成腳本。</w:t>
       </w:r>
     </w:p>
     <w:p>
@@ -659,7 +722,7 @@
         </w:rPr>
         <w:t xml:space="preserve">用瀏覽器開啟原始專案: </w:t>
       </w:r>
-      <w:hyperlink w:history="1" r:id="rIdsg3ohtdfucpzchgfjlsyx">
+      <w:hyperlink w:history="1" r:id="rId1d0qe4jpjz7u2xr4u6fqv">
         <w:r>
           <w:rPr>
             <w:rStyle w:val="Hyperlink"/>
@@ -975,7 +1038,7 @@
         </w:rPr>
         <w:t xml:space="preserve">用瀏覽器開 </w:t>
       </w:r>
-      <w:hyperlink w:history="1" r:id="rIdaxhup9d_6i3rcrkvll0yj">
+      <w:hyperlink w:history="1" r:id="rIdkvwrigieryed_h2a9m65c">
         <w:r>
           <w:rPr>
             <w:rStyle w:val="Hyperlink"/>
@@ -2040,7 +2103,7 @@
         </w:rPr>
         <w:t xml:space="preserve">:到 </w:t>
       </w:r>
-      <w:hyperlink w:history="1" r:id="rIdxq02nz30f9vwtys4_bxqy">
+      <w:hyperlink w:history="1" r:id="rIdjorhyqjf4zsgqnd42dgnw">
         <w:r>
           <w:rPr>
             <w:rStyle w:val="Hyperlink"/>
@@ -2844,7 +2907,7 @@
         </w:rPr>
         <w:t xml:space="preserve">開 </w:t>
       </w:r>
-      <w:hyperlink w:history="1" r:id="rIdv9pwtaqjvdnlbu-s8jqev">
+      <w:hyperlink w:history="1" r:id="rIdgih3fa6wqe2xu1dima6gc">
         <w:r>
           <w:rPr>
             <w:rStyle w:val="Hyperlink"/>
@@ -4262,7 +4325,7 @@
         <w:rPr>
           <w:rFonts w:ascii="微軟正黑體" w:cs="微軟正黑體" w:eastAsia="微軟正黑體" w:hAnsi="微軟正黑體"/>
         </w:rPr>
-        <w:t xml:space="preserve">,從 L01 (最簡單) 到 L70。每級 100 字。</w:t>
+        <w:t xml:space="preserve">,從 Level 1 (最簡單) 到 Level 6。每級約 1,000 字,合計 6,255 字,字庫已內建在程式碼裡,不用自己準備。</w:t>
       </w:r>
     </w:p>
     <w:p>

</xml_diff>